<commit_message>
Shorter title; explicit contributions paragraph; table and reference formatting
Co-Authored-By: Claude Opus 5.5 <noreply@anthropic.com>
</commit_message>
<xml_diff>
--- a/abstract/ABSTRACT - The Hidden Core of Romanian.docx
+++ b/abstract/ABSTRACT - The Hidden Core of Romanian.docx
@@ -7,7 +7,7 @@
         <w:pStyle w:val="ArticleTitle"/>
       </w:pPr>
       <w:r>
-        <w:t>The Hidden Core of Romanian: Latent Structure of the DEX and Graur’s Fundamental Lexical Stock</w:t>
+        <w:t>The Hidden Core of Romanian: The Words That Define All Others</w:t>
       </w:r>
     </w:p>
     <w:p>
@@ -1874,7 +1874,7 @@
       <w:keepNext w:val="0"/>
       <w:spacing w:line="252" w:lineRule="auto" w:before="0" w:after="120"/>
       <w:ind w:left="0" w:right="0" w:hanging="227"/>
-      <w:jc w:val="both"/>
+      <w:jc w:val="left"/>
     </w:pPr>
     <w:rPr>
       <w:rFonts w:ascii="Times New Roman" w:hAnsi="Times New Roman" w:eastAsia="Times New Roman" w:cs="Times New Roman"/>

</xml_diff>

<commit_message>
Calibration against English WordNet under identical processing; DEX without function words
The DEX Kernel is about twice and its MinSet about four times the WordNet values
obtained with the same procedure; removing function words changes little.
Paper, abstract, slides and README updated; download script for the
cross-linguistic Wiktionary comparison.

Co-Authored-By: Claude Opus 5.5 <noreply@anthropic.com>
</commit_message>
<xml_diff>
--- a/abstract/ABSTRACT - The Hidden Core of Romanian.docx
+++ b/abstract/ABSTRACT - The Hidden Core of Romanian.docx
@@ -65,7 +65,7 @@
         <w:pStyle w:val="AbstractText"/>
       </w:pPr>
       <w:r>
-        <w:t>Dictionaries define words by other words, so every dictionary is circular: a reader who knows none of the defining words can learn nothing from it. Vincent-Lamarre et al. (2016) measured this circularity in English dictionaries by representing a dictionary as a directed graph in which each word is linked to the headwords in whose definitions it occurs. They computed two sets: the Kernel, the part of the dictionary from which all other headwords can be defined (7–12% of headwords), and the minimal grounding set (MinSet), the smallest set of words from which every other headword can be learned through definitions (about 1%).</w:t>
+        <w:t>Dictionaries define words by other words, so every dictionary is circular: a reader who knows none of the defining words can learn nothing from it. Vincent-Lamarre et al. (2016) measured this circularity in English dictionaries by representing a dictionary as a directed graph in which each word is linked to the headwords in whose definitions it occurs. They computed two sets: the Kernel, the part from which all other headwords can be defined (7–12% of headwords), and the minimal grounding set (MinSet), the smallest set of words from which every other headword can be learned through definitions (about 1%).</w:t>
       </w:r>
     </w:p>
     <w:p>
@@ -121,7 +121,7 @@
         <w:pStyle w:val="AbstractText"/>
       </w:pPr>
       <w:r>
-        <w:t>The Kernel of the DEX contains 33.2% of the headwords and the MinSet 9.7–9.9%, three to five and about ten times, respectively, the proportions found in English. The main cause is reciprocal definition: 8,761 pairs of headwords occur in each other’s definitions (</w:t>
+        <w:t>The Kernel of the DEX contains 33.2% of the headwords and the MinSet 9.7–9.9%, about two and four times, respectively, the proportions that the same procedure gives for the English WordNet. The main cause is reciprocal definition: 8,761 pairs of headwords occur in each other’s definitions (</w:t>
       </w:r>
       <w:r>
         <w:rPr>
@@ -131,7 +131,7 @@
         <w:t>arbore–copac</w:t>
       </w:r>
       <w:r>
-        <w:t>, both ‘tree’). The Kernel nevertheless contains the basic vocabulary: 98% of the Romanian equivalents of the Swadesh list, a standard list of about 200 basic meanings used in comparative linguistics, and 94.5% of the 1,419 words that Graur (1954) proposed as the fundamental lexical stock of Romanian, against 33.2% expected by chance. The words used most often in definitions, by contrast, are mainly learned French loanwords. The data and code are publicly available.</w:t>
+        <w:t>, both ‘tree’). Yet the Kernel contains the basic vocabulary: 98% of the Romanian equivalents of the Swadesh list, a standard list of about 200 basic meanings used in comparative linguistics, and 94.5% of the 1,419 words that Graur (1954) proposed as the fundamental lexical stock of Romanian, against 33.2% expected by chance. The words most used in definitions, by contrast, are mainly learned French loanwords. The data and code are publicly available.</w:t>
       </w:r>
     </w:p>
     <w:p>

</xml_diff>

<commit_message>
Cross-linguistic comparison in the paper (section 4.2, figure 5, table 2), abstract and slides
Abstract merges the co-author's framing with the current results. Paper now 12 pages.

Co-Authored-By: Claude Opus 5.5 <noreply@anthropic.com>
</commit_message>
<xml_diff>
--- a/abstract/ABSTRACT - The Hidden Core of Romanian.docx
+++ b/abstract/ABSTRACT - The Hidden Core of Romanian.docx
@@ -65,7 +65,7 @@
         <w:pStyle w:val="AbstractText"/>
       </w:pPr>
       <w:r>
-        <w:t>Dictionaries define words by other words, so every dictionary is circular: a reader who knows none of the defining words can learn nothing from it. Vincent-Lamarre et al. (2016) measured this circularity in English dictionaries by representing a dictionary as a directed graph in which each word is linked to the headwords in whose definitions it occurs. They computed two sets: the Kernel, the part from which all other headwords can be defined (7–12% of headwords), and the minimal grounding set (MinSet), the smallest set of words from which every other headword can be learned through definitions (about 1%).</w:t>
+        <w:t>Dictionaries define words by other words, so a dictionary can teach new words only to a reader who already knows part of its vocabulary. Representing a dictionary as a directed graph, in which each word points to the headwords in whose definitions it occurs, makes this part measurable (Vincent-Lamarre et al., 2016). The Kernel is the part from which all other headwords can be defined; a minimal grounding set (MinSet) is a smallest set of words from which every other headword can be learned through definitions alone.</w:t>
       </w:r>
     </w:p>
     <w:p>
@@ -73,7 +73,7 @@
         <w:pStyle w:val="AbstractText"/>
       </w:pPr>
       <w:r>
-        <w:t>We apply the method for the first time to Romanian, to the second edition of the DEX (</w:t>
+        <w:t>We analyse this graph for the second edition of the DEX (</w:t>
       </w:r>
       <w:r>
         <w:rPr>
@@ -83,7 +83,7 @@
         <w:t>Dicționarul explicativ al limbii române</w:t>
       </w:r>
       <w:r>
-        <w:t>) digitised by dexonline (63,843 headwords). Many word forms in definitions are ambiguous (</w:t>
+        <w:t>), digitised by dexonline: 63,843 headwords and 600,473 definitional links. Because Romanian is richly inflected, many word forms in definitions are ambiguous (</w:t>
       </w:r>
       <w:r>
         <w:rPr>
@@ -113,7 +113,7 @@
         <w:t>ara</w:t>
       </w:r>
       <w:r>
-        <w:t xml:space="preserve"> ‘plough’). A large language model assigns each such form to a headword; on a random sample it agrees with a stronger model on 87% of content-word decisions, and all results are repeated with two procedures that use no model.</w:t>
+        <w:t xml:space="preserve"> ‘plough’). A large language model assigns each to a headword; all results are repeated without the model, and integer linear programming bounds the MinSet.</w:t>
       </w:r>
     </w:p>
     <w:p>
@@ -121,7 +121,7 @@
         <w:pStyle w:val="AbstractText"/>
       </w:pPr>
       <w:r>
-        <w:t>The Kernel of the DEX contains 33.2% of the headwords and the MinSet 9.7–9.9%, about two and four times, respectively, the proportions that the same procedure gives for the English WordNet. The main cause is reciprocal definition: 8,761 pairs of headwords occur in each other’s definitions (</w:t>
+        <w:t>The Kernel of the DEX contains 33.2% of the headwords and the MinSet 9.7–9.9%. Processed in the same way, dictionaries of eleven other languages have MinSets of 0.6–3.1%. The difference comes mainly from reciprocal definition, five to twenty times more frequent in the DEX: 8,761 pairs of headwords occur in each other’s definitions (</w:t>
       </w:r>
       <w:r>
         <w:rPr>
@@ -131,7 +131,7 @@
         <w:t>arbore–copac</w:t>
       </w:r>
       <w:r>
-        <w:t>, both ‘tree’). Yet the Kernel contains the basic vocabulary: 98% of the Romanian equivalents of the Swadesh list, a standard list of about 200 basic meanings used in comparative linguistics, and 94.5% of the 1,419 words that Graur (1954) proposed as the fundamental lexical stock of Romanian, against 33.2% expected by chance. The words most used in definitions, by contrast, are mainly learned French loanwords. The data and code are publicly available.</w:t>
+        <w:t>, both ‘tree’). Although derived only from definitions, the Kernel contains 98% of the Romanian equivalents of the Swadesh list, a standard list of about 200 basic meanings used in comparative linguistics, and 94.5% of the 1,419 words that Graur (1954) proposed as the fundamental lexical stock of Romanian, against 33.2% expected by chance. The words most used in definitions, in contrast, are mainly learned French loanwords. Dictionary definitions thus preserve a linguistically meaningful lexical core, and the graph gives lexicographers a map of circularity. Data and code are public.</w:t>
       </w:r>
     </w:p>
     <w:p>

</xml_diff>

<commit_message>
Abstract and title from the co-author's version; replace the misleading are/ara example
Title: The Hidden Core of Romanian: A Graph-Theoretic Analysis of Dictionary Definitions.
Ambiguity is now illustrated with sare ('salt' / 'jumps') and fire, taken from DEX definitions.

Co-Authored-By: Claude Opus 5.5 <noreply@anthropic.com>
</commit_message>
<xml_diff>
--- a/abstract/ABSTRACT - The Hidden Core of Romanian.docx
+++ b/abstract/ABSTRACT - The Hidden Core of Romanian.docx
@@ -7,7 +7,7 @@
         <w:pStyle w:val="ArticleTitle"/>
       </w:pPr>
       <w:r>
-        <w:t>The Hidden Core of Romanian: The Words That Define All Others</w:t>
+        <w:t>The Hidden Core of Romanian: A Graph-Theoretic Analysis of Dictionary Definitions</w:t>
       </w:r>
     </w:p>
     <w:p>
@@ -65,7 +65,7 @@
         <w:pStyle w:val="AbstractText"/>
       </w:pPr>
       <w:r>
-        <w:t>Dictionaries define words by other words, so a dictionary can teach new words only to a reader who already knows part of its vocabulary. Representing a dictionary as a directed graph, in which each word points to the headwords in whose definitions it occurs, makes this part measurable (Vincent-Lamarre et al., 2016). The Kernel is the part from which all other headwords can be defined; a minimal grounding set (MinSet) is a smallest set of words from which every other headword can be learned through definitions alone.</w:t>
+        <w:t>Dictionary definitions are inherently circular, as words are defined through other words. Consequently, a dictionary can only support lexical acquisition if part of its vocabulary is already known. Previous studies have shown that a dictionary represented as a directed graph contains a Kernel, from which all other words can be defined, and one or more minimal grounding sets (MinSets), the smallest sets of words that provide the lexical basis of the entire dictionary (Vincent-Lamarre et al., 2016).</w:t>
       </w:r>
     </w:p>
     <w:p>
@@ -73,7 +73,7 @@
         <w:pStyle w:val="AbstractText"/>
       </w:pPr>
       <w:r>
-        <w:t>We analyse this graph for the second edition of the DEX (</w:t>
+        <w:t xml:space="preserve">In this study, we construct and analyse a graph representation of the </w:t>
       </w:r>
       <w:r>
         <w:rPr>
@@ -83,37 +83,7 @@
         <w:t>Dicționarul explicativ al limbii române</w:t>
       </w:r>
       <w:r>
-        <w:t>), digitised by dexonline: 63,843 headwords and 600,473 definitional links. Because Romanian is richly inflected, many word forms in definitions are ambiguous (</w:t>
-      </w:r>
-      <w:r>
-        <w:rPr>
-          <w:i/>
-          <w:lang w:val="ro-RO"/>
-        </w:rPr>
-        <w:t>are</w:t>
-      </w:r>
-      <w:r>
-        <w:t xml:space="preserve">: </w:t>
-      </w:r>
-      <w:r>
-        <w:rPr>
-          <w:i/>
-          <w:lang w:val="ro-RO"/>
-        </w:rPr>
-        <w:t>avea</w:t>
-      </w:r>
-      <w:r>
-        <w:t xml:space="preserve"> ‘have’ or </w:t>
-      </w:r>
-      <w:r>
-        <w:rPr>
-          <w:i/>
-          <w:lang w:val="ro-RO"/>
-        </w:rPr>
-        <w:t>ara</w:t>
-      </w:r>
-      <w:r>
-        <w:t xml:space="preserve"> ‘plough’). A large language model assigns each to a headword; all results are repeated without the model, and integer linear programming bounds the MinSet.</w:t>
+        <w:t xml:space="preserve"> (DEX, second edition, digitised by dexonline), comprising 63,843 headwords and 600,473 definitional relations. Because Romanian exhibits extensive inflection and lexical ambiguity, automatic lemmatisation and headword assignment were required; these were performed using a large language model and evaluated against a stronger language model and two model-free baselines. Across all methods, the resulting graph structure proved highly stable.</w:t>
       </w:r>
     </w:p>
     <w:p>
@@ -121,17 +91,15 @@
         <w:pStyle w:val="AbstractText"/>
       </w:pPr>
       <w:r>
-        <w:t>The Kernel of the DEX contains 33.2% of the headwords and the MinSet 9.7–9.9%. Processed in the same way, dictionaries of eleven other languages have MinSets of 0.6–3.1%. The difference comes mainly from reciprocal definition, five to twenty times more frequent in the DEX: 8,761 pairs of headwords occur in each other’s definitions (</w:t>
+        <w:t>Our analysis reveals that the DEX Kernel contains 21,216 words (33.2% of all headwords), while its MinSets comprise between 6,193 and 6,325 words (9.7–9.9%). These proportions are substantially larger than those obtained with the same procedure for dictionaries of eleven other languages (MinSets of 0.6–3.1%). We show that this difference is primarily attributable to reciprocal definitional relations, particularly prevalent in the lexicographic practice of the DEX. Despite its graph-theoretic derivation, the Kernel exhibits a close correspondence with independently established notions of fundamental vocabulary: it contains 98% of the Romanian equivalents of the Swadesh list, a standard list of about 200 basic meanings, and 94.5% of the fundamental lexical stock proposed by Graur (1954).</w:t>
       </w:r>
+    </w:p>
+    <w:p>
+      <w:pPr>
+        <w:pStyle w:val="AbstractText"/>
+      </w:pPr>
       <w:r>
-        <w:rPr>
-          <w:i/>
-          <w:lang w:val="ro-RO"/>
-        </w:rPr>
-        <w:t>arbore–copac</w:t>
-      </w:r>
-      <w:r>
-        <w:t>, both ‘tree’). Although derived only from definitions, the Kernel contains 98% of the Romanian equivalents of the Swadesh list, a standard list of about 200 basic meanings used in comparative linguistics, and 94.5% of the 1,419 words that Graur (1954) proposed as the fundamental lexical stock of Romanian, against 33.2% expected by chance. The words most used in definitions, in contrast, are mainly learned French loanwords. Dictionary definitions thus preserve a linguistically meaningful lexical core, and the graph gives lexicographers a map of circularity. Data and code are public.</w:t>
+        <w:t>These findings suggest that the latent structure of dictionary definitions captures a linguistically meaningful lexical core. More broadly, the results show that graph-theoretic approaches can uncover fundamental vocabulary layers in morphologically rich languages.</w:t>
       </w:r>
     </w:p>
     <w:p>

</xml_diff>

<commit_message>
Full review of paper and slides: consistent ranges, figures redrawn at print size, reference fixes, cross-linguistic wording in slides
Co-Authored-By: Claude Opus 5.5 <noreply@anthropic.com>
</commit_message>
<xml_diff>
--- a/abstract/ABSTRACT - The Hidden Core of Romanian.docx
+++ b/abstract/ABSTRACT - The Hidden Core of Romanian.docx
@@ -73,7 +73,7 @@
         <w:pStyle w:val="AbstractText"/>
       </w:pPr>
       <w:r>
-        <w:t xml:space="preserve">In this study, we construct and analyse a graph representation of the </w:t>
+        <w:t xml:space="preserve">We construct and analyse a graph representation of the second edition of the </w:t>
       </w:r>
       <w:r>
         <w:rPr>
@@ -83,7 +83,7 @@
         <w:t>Dicționarul explicativ al limbii române</w:t>
       </w:r>
       <w:r>
-        <w:t xml:space="preserve"> (DEX, second edition, digitised by dexonline), comprising 63,843 headwords and 600,473 definitional relations. Because Romanian exhibits extensive inflection and lexical ambiguity, automatic lemmatisation and headword assignment were required; these were performed using a large language model and evaluated against a stronger language model and two model-free baselines. Across all methods, the resulting graph structure proved highly stable.</w:t>
+        <w:t xml:space="preserve"> (‘Explanatory Dictionary of the Romanian Language’, DEX), comprising 63,843 headwords and 600,473 definitional relations. Because Romanian exhibits extensive inflection and lexical ambiguity, automatic lemmatisation and headword assignment were required; these were performed using a large language model and evaluated against a stronger language model and two model-free baselines. Across all methods, the resulting graph structure proved highly stable.</w:t>
       </w:r>
     </w:p>
     <w:p>

</xml_diff>